<commit_message>
last updates on forms
</commit_message>
<xml_diff>
--- a/MCERT-frontend/public/templates/mclerts-template-3.docx
+++ b/MCERT-frontend/public/templates/mclerts-template-3.docx
@@ -2979,6 +2979,11 @@
       </w:r>
     </w:p>
     <w:p>
+      <w:r>
+        <w:br w:type="page"/>
+      </w:r>
+    </w:p>
+    <w:p>
       <w:pPr>
         <w:rPr>
           <w:rFonts w:ascii="Calibri" w:hAnsi="Calibri" w:cs="Arial"/>
@@ -4948,10 +4953,6 @@
     </w:p>
     <w:p>
       <w:pPr>
-        <w:rPr>
-          <w:rFonts w:ascii="Calibri" w:hAnsi="Calibri" w:cs="Arial"/>
-          <w:highlight w:val="green"/>
-        </w:rPr>
         <w:sectPr>
           <w:type w:val="continuous"/>
           <w:pgSz w:w="12240" w:h="15840" w:code="1"/>
@@ -4961,302 +4962,7 @@
       </w:pPr>
     </w:p>
     <w:p>
-      <w:pPr>
-        <w:rPr>
-          <w:rFonts w:ascii="Calibri" w:hAnsi="Calibri" w:cs="Arial"/>
-          <w:highlight w:val="green"/>
-        </w:rPr>
-      </w:pPr>
-    </w:p>
-    <w:p>
-      <w:pPr>
-        <w:rPr>
-          <w:rFonts w:ascii="Calibri" w:hAnsi="Calibri" w:cs="Arial"/>
-          <w:highlight w:val="green"/>
-        </w:rPr>
-      </w:pPr>
-    </w:p>
-    <w:p>
-      <w:pPr>
-        <w:rPr>
-          <w:rFonts w:ascii="Calibri" w:hAnsi="Calibri" w:cs="Arial"/>
-          <w:highlight w:val="green"/>
-        </w:rPr>
-      </w:pPr>
-    </w:p>
-    <w:p>
-      <w:pPr>
-        <w:rPr>
-          <w:rFonts w:ascii="Calibri" w:hAnsi="Calibri" w:cs="Arial"/>
-          <w:highlight w:val="green"/>
-        </w:rPr>
-      </w:pPr>
-    </w:p>
-    <w:p>
-      <w:pPr>
-        <w:rPr>
-          <w:rFonts w:ascii="Calibri" w:hAnsi="Calibri" w:cs="Arial"/>
-          <w:highlight w:val="green"/>
-        </w:rPr>
-      </w:pPr>
-    </w:p>
-    <w:p>
-      <w:pPr>
-        <w:rPr>
-          <w:rFonts w:ascii="Calibri" w:hAnsi="Calibri" w:cs="Arial"/>
-          <w:highlight w:val="green"/>
-        </w:rPr>
-      </w:pPr>
-    </w:p>
-    <w:p>
-      <w:pPr>
-        <w:rPr>
-          <w:rFonts w:ascii="Calibri" w:hAnsi="Calibri" w:cs="Arial"/>
-          <w:highlight w:val="green"/>
-        </w:rPr>
-      </w:pPr>
-    </w:p>
-    <w:p>
-      <w:pPr>
-        <w:rPr>
-          <w:rFonts w:ascii="Calibri" w:hAnsi="Calibri" w:cs="Arial"/>
-          <w:highlight w:val="green"/>
-        </w:rPr>
-      </w:pPr>
-    </w:p>
-    <w:p>
-      <w:pPr>
-        <w:rPr>
-          <w:rFonts w:ascii="Calibri" w:hAnsi="Calibri" w:cs="Arial"/>
-          <w:highlight w:val="green"/>
-        </w:rPr>
-      </w:pPr>
-    </w:p>
-    <w:p>
-      <w:pPr>
-        <w:rPr>
-          <w:rFonts w:ascii="Calibri" w:hAnsi="Calibri" w:cs="Arial"/>
-          <w:highlight w:val="green"/>
-        </w:rPr>
-      </w:pPr>
-    </w:p>
-    <w:p>
-      <w:pPr>
-        <w:rPr>
-          <w:rFonts w:ascii="Calibri" w:hAnsi="Calibri" w:cs="Arial"/>
-          <w:highlight w:val="green"/>
-        </w:rPr>
-      </w:pPr>
-    </w:p>
-    <w:p>
-      <w:pPr>
-        <w:rPr>
-          <w:rFonts w:ascii="Calibri" w:hAnsi="Calibri" w:cs="Arial"/>
-          <w:highlight w:val="green"/>
-        </w:rPr>
-      </w:pPr>
-    </w:p>
-    <w:p>
-      <w:pPr>
-        <w:rPr>
-          <w:rFonts w:ascii="Calibri" w:hAnsi="Calibri" w:cs="Arial"/>
-          <w:highlight w:val="green"/>
-        </w:rPr>
-      </w:pPr>
-    </w:p>
-    <w:p>
-      <w:pPr>
-        <w:rPr>
-          <w:rFonts w:ascii="Calibri" w:hAnsi="Calibri" w:cs="Arial"/>
-          <w:highlight w:val="green"/>
-        </w:rPr>
-      </w:pPr>
-    </w:p>
-    <w:p>
-      <w:pPr>
-        <w:rPr>
-          <w:rFonts w:ascii="Calibri" w:hAnsi="Calibri" w:cs="Arial"/>
-          <w:highlight w:val="green"/>
-        </w:rPr>
-      </w:pPr>
-    </w:p>
-    <w:p>
-      <w:pPr>
-        <w:rPr>
-          <w:rFonts w:ascii="Calibri" w:hAnsi="Calibri" w:cs="Arial"/>
-          <w:highlight w:val="green"/>
-        </w:rPr>
-      </w:pPr>
-    </w:p>
-    <w:p>
-      <w:pPr>
-        <w:rPr>
-          <w:rFonts w:ascii="Calibri" w:hAnsi="Calibri" w:cs="Arial"/>
-          <w:highlight w:val="green"/>
-        </w:rPr>
-      </w:pPr>
-    </w:p>
-    <w:p>
-      <w:pPr>
-        <w:rPr>
-          <w:rFonts w:ascii="Calibri" w:hAnsi="Calibri" w:cs="Arial"/>
-          <w:highlight w:val="green"/>
-        </w:rPr>
-      </w:pPr>
-    </w:p>
-    <w:p>
-      <w:pPr>
-        <w:rPr>
-          <w:rFonts w:ascii="Calibri" w:hAnsi="Calibri" w:cs="Arial"/>
-          <w:highlight w:val="green"/>
-        </w:rPr>
-      </w:pPr>
-    </w:p>
-    <w:p>
-      <w:pPr>
-        <w:rPr>
-          <w:rFonts w:ascii="Calibri" w:hAnsi="Calibri" w:cs="Arial"/>
-          <w:highlight w:val="green"/>
-        </w:rPr>
-      </w:pPr>
-    </w:p>
-    <w:p>
-      <w:pPr>
-        <w:rPr>
-          <w:rFonts w:ascii="Calibri" w:hAnsi="Calibri" w:cs="Arial"/>
-          <w:highlight w:val="green"/>
-        </w:rPr>
-      </w:pPr>
-    </w:p>
-    <w:p>
-      <w:pPr>
-        <w:rPr>
-          <w:rFonts w:ascii="Calibri" w:hAnsi="Calibri" w:cs="Arial"/>
-          <w:highlight w:val="green"/>
-        </w:rPr>
-      </w:pPr>
-    </w:p>
-    <w:p>
-      <w:pPr>
-        <w:rPr>
-          <w:rFonts w:ascii="Calibri" w:hAnsi="Calibri" w:cs="Arial"/>
-          <w:highlight w:val="green"/>
-        </w:rPr>
-      </w:pPr>
-    </w:p>
-    <w:p>
-      <w:pPr>
-        <w:rPr>
-          <w:rFonts w:ascii="Calibri" w:hAnsi="Calibri" w:cs="Arial"/>
-          <w:highlight w:val="green"/>
-        </w:rPr>
-      </w:pPr>
-    </w:p>
-    <w:p>
-      <w:pPr>
-        <w:rPr>
-          <w:rFonts w:ascii="Calibri" w:hAnsi="Calibri" w:cs="Arial"/>
-          <w:highlight w:val="green"/>
-        </w:rPr>
-      </w:pPr>
-    </w:p>
-    <w:p>
-      <w:pPr>
-        <w:rPr>
-          <w:rFonts w:ascii="Calibri" w:hAnsi="Calibri" w:cs="Arial"/>
-          <w:highlight w:val="green"/>
-        </w:rPr>
-      </w:pPr>
-    </w:p>
-    <w:p>
-      <w:pPr>
-        <w:rPr>
-          <w:rFonts w:ascii="Calibri" w:hAnsi="Calibri" w:cs="Arial"/>
-          <w:highlight w:val="green"/>
-        </w:rPr>
-      </w:pPr>
-    </w:p>
-    <w:p>
-      <w:pPr>
-        <w:rPr>
-          <w:rFonts w:ascii="Calibri" w:hAnsi="Calibri" w:cs="Arial"/>
-          <w:highlight w:val="green"/>
-        </w:rPr>
-      </w:pPr>
-    </w:p>
-    <w:p>
-      <w:pPr>
-        <w:rPr>
-          <w:rFonts w:ascii="Calibri" w:hAnsi="Calibri" w:cs="Arial"/>
-          <w:highlight w:val="green"/>
-        </w:rPr>
-      </w:pPr>
-    </w:p>
-    <w:p>
-      <w:pPr>
-        <w:rPr>
-          <w:rFonts w:ascii="Calibri" w:hAnsi="Calibri" w:cs="Arial"/>
-          <w:highlight w:val="green"/>
-        </w:rPr>
-      </w:pPr>
-    </w:p>
-    <w:p>
-      <w:pPr>
-        <w:rPr>
-          <w:rFonts w:ascii="Calibri" w:hAnsi="Calibri" w:cs="Arial"/>
-          <w:highlight w:val="green"/>
-        </w:rPr>
-      </w:pPr>
-    </w:p>
-    <w:p>
-      <w:pPr>
-        <w:rPr>
-          <w:rFonts w:ascii="Calibri" w:hAnsi="Calibri" w:cs="Arial"/>
-          <w:highlight w:val="green"/>
-        </w:rPr>
-      </w:pPr>
-    </w:p>
-    <w:p>
-      <w:pPr>
-        <w:rPr>
-          <w:rFonts w:asciiTheme="minorHAnsi" w:hAnsiTheme="minorHAnsi" w:cstheme="minorHAnsi"/>
-        </w:rPr>
-      </w:pPr>
-    </w:p>
-    <w:p>
-      <w:pPr>
-        <w:jc w:val="center"/>
-        <w:rPr>
-          <w:rFonts w:ascii="Calibri" w:hAnsi="Calibri" w:cs="Arial"/>
-          <w:highlight w:val="green"/>
-        </w:rPr>
-      </w:pPr>
-    </w:p>
-    <w:p>
-      <w:pPr>
-        <w:jc w:val="center"/>
-        <w:rPr>
-          <w:rFonts w:ascii="Calibri" w:hAnsi="Calibri" w:cs="Arial"/>
-        </w:rPr>
-      </w:pPr>
-    </w:p>
-    <w:p>
-      <w:pPr>
-        <w:rPr>
-          <w:rFonts w:ascii="Calibri" w:hAnsi="Calibri" w:cs="Arial"/>
-        </w:rPr>
-      </w:pPr>
-    </w:p>
-    <w:p>
-      <w:pPr>
-        <w:rPr>
-          <w:rFonts w:ascii="Calibri" w:hAnsi="Calibri" w:cs="Arial"/>
-        </w:rPr>
-      </w:pPr>
-      <w:r>
-        <w:rPr>
-          <w:rFonts w:ascii="Calibri" w:hAnsi="Calibri" w:cs="Arial"/>
-        </w:rPr>
+      <w:r>
         <w:br w:type="page"/>
       </w:r>
     </w:p>
@@ -6888,6 +6594,11 @@
           <w:u w:val="single"/>
         </w:rPr>
       </w:pPr>
+    </w:p>
+    <w:p>
+      <w:r>
+        <w:br w:type="page"/>
+      </w:r>
     </w:p>
     <w:p>
       <w:pPr>

</xml_diff>

<commit_message>
final chnges after deployment
</commit_message>
<xml_diff>
--- a/MCERT-frontend/public/templates/mclerts-template-3.docx
+++ b/MCERT-frontend/public/templates/mclerts-template-3.docx
@@ -2978,11 +2978,7 @@
         <w:t>aintenance</w:t>
       </w:r>
     </w:p>
-    <w:p>
-      <w:r>
-        <w:br w:type="page"/>
-      </w:r>
-    </w:p>
+    <w:p/>
     <w:p>
       <w:pPr>
         <w:rPr>

</xml_diff>